<commit_message>
V2 Inclusion del Nombre
</commit_message>
<xml_diff>
--- a/CONVOCATORIA DEVNET.docx
+++ b/CONVOCATORIA DEVNET.docx
@@ -1,6 +1,6 @@
 
 <file path=word/document.xml><?xml version="1.0" encoding="utf-8"?>
-<w:document xmlns:wpc="http://schemas.microsoft.com/office/word/2010/wordprocessingCanvas" xmlns:cx="http://schemas.microsoft.com/office/drawing/2014/chartex" xmlns:cx1="http://schemas.microsoft.com/office/drawing/2015/9/8/chartex" xmlns:cx2="http://schemas.microsoft.com/office/drawing/2015/10/21/chartex" xmlns:cx3="http://schemas.microsoft.com/office/drawing/2016/5/9/chartex" xmlns:cx4="http://schemas.microsoft.com/office/drawing/2016/5/10/chartex" xmlns:cx5="http://schemas.microsoft.com/office/drawing/2016/5/11/chartex" xmlns:cx6="http://schemas.microsoft.com/office/drawing/2016/5/12/chartex" xmlns:cx7="http://schemas.microsoft.com/office/drawing/2016/5/13/chartex" xmlns:cx8="http://schemas.microsoft.com/office/drawing/2016/5/14/chartex" xmlns:mc="http://schemas.openxmlformats.org/markup-compatibility/2006" xmlns:aink="http://schemas.microsoft.com/office/drawing/2016/ink" xmlns:am3d="http://schemas.microsoft.com/office/drawing/2017/model3d" xmlns:o="urn:schemas-microsoft-com:office:office" xmlns:oel="http://schemas.microsoft.com/office/2019/extlst" xmlns:r="http://schemas.openxmlformats.org/officeDocument/2006/relationships" xmlns:m="http://schemas.openxmlformats.org/officeDocument/2006/math" xmlns:v="urn:schemas-microsoft-com:vml" xmlns:wp14="http://schemas.microsoft.com/office/word/2010/wordprocessingDrawing" xmlns:wp="http://schemas.openxmlformats.org/drawingml/2006/wordprocessingDrawing" xmlns:w10="urn:schemas-microsoft-com:office:word" xmlns:w="http://schemas.openxmlformats.org/wordprocessingml/2006/main" xmlns:w14="http://schemas.microsoft.com/office/word/2010/wordml" xmlns:w15="http://schemas.microsoft.com/office/word/2012/wordml" xmlns:w16cex="http://schemas.microsoft.com/office/word/2018/wordml/cex" xmlns:w16cid="http://schemas.microsoft.com/office/word/2016/wordml/cid" xmlns:w16="http://schemas.microsoft.com/office/word/2018/wordml" xmlns:w16du="http://schemas.microsoft.com/office/word/2023/wordml/word16du" xmlns:w16sdtdh="http://schemas.microsoft.com/office/word/2020/wordml/sdtdatahash" xmlns:w16sdtfl="http://schemas.microsoft.com/office/word/2024/wordml/sdtformatlock" xmlns:w16se="http://schemas.microsoft.com/office/word/2015/wordml/symex" xmlns:wpg="http://schemas.microsoft.com/office/word/2010/wordprocessingGroup" xmlns:wpi="http://schemas.microsoft.com/office/word/2010/wordprocessingInk" xmlns:wne="http://schemas.microsoft.com/office/word/2006/wordml" xmlns:wps="http://schemas.microsoft.com/office/word/2010/wordprocessingShape" mc:Ignorable="w14 w15 w16se w16cid w16 w16cex w16sdtdh w16sdtfl w16du wp14">
+<w:document xmlns:wpc="http://schemas.microsoft.com/office/word/2010/wordprocessingCanvas" xmlns:cx="http://schemas.microsoft.com/office/drawing/2014/chartex" xmlns:cx1="http://schemas.microsoft.com/office/drawing/2015/9/8/chartex" xmlns:cx2="http://schemas.microsoft.com/office/drawing/2015/10/21/chartex" xmlns:cx3="http://schemas.microsoft.com/office/drawing/2016/5/9/chartex" xmlns:cx4="http://schemas.microsoft.com/office/drawing/2016/5/10/chartex" xmlns:cx5="http://schemas.microsoft.com/office/drawing/2016/5/11/chartex" xmlns:cx6="http://schemas.microsoft.com/office/drawing/2016/5/12/chartex" xmlns:cx7="http://schemas.microsoft.com/office/drawing/2016/5/13/chartex" xmlns:cx8="http://schemas.microsoft.com/office/drawing/2016/5/14/chartex" xmlns:mc="http://schemas.openxmlformats.org/markup-compatibility/2006" xmlns:aink="http://schemas.microsoft.com/office/drawing/2016/ink" xmlns:am3d="http://schemas.microsoft.com/office/drawing/2017/model3d" xmlns:o="urn:schemas-microsoft-com:office:office" xmlns:r="http://schemas.openxmlformats.org/officeDocument/2006/relationships" xmlns:m="http://schemas.openxmlformats.org/officeDocument/2006/math" xmlns:v="urn:schemas-microsoft-com:vml" xmlns:wp14="http://schemas.microsoft.com/office/word/2010/wordprocessingDrawing" xmlns:wp="http://schemas.openxmlformats.org/drawingml/2006/wordprocessingDrawing" xmlns:w10="urn:schemas-microsoft-com:office:word" xmlns:w="http://schemas.openxmlformats.org/wordprocessingml/2006/main" xmlns:w14="http://schemas.microsoft.com/office/word/2010/wordml" xmlns:w15="http://schemas.microsoft.com/office/word/2012/wordml" xmlns:w16cid="http://schemas.microsoft.com/office/word/2016/wordml/cid" xmlns:w16se="http://schemas.microsoft.com/office/word/2015/wordml/symex" xmlns:wpg="http://schemas.microsoft.com/office/word/2010/wordprocessingGroup" xmlns:wpi="http://schemas.microsoft.com/office/word/2010/wordprocessingInk" xmlns:wne="http://schemas.microsoft.com/office/word/2006/wordml" xmlns:wps="http://schemas.microsoft.com/office/word/2010/wordprocessingShape" mc:Ignorable="w14 w15 w16se w16cid wp14">
   <w:body>
     <w:p>
       <w:pPr>
@@ -1920,8 +1920,8 @@
           <w:rFonts w:cstheme="majorHAnsi"/>
           <w:bCs w:val="0"/>
           <w:iCs/>
-          <w:color w:val="000000" w:themeColor="text1"/>
-          <w:sz w:val="22"/>
+          <w:color w:val="FF0000"/>
+          <w:sz w:val="28"/>
           <w:szCs w:val="22"/>
         </w:rPr>
         <w:t>16</w:t>
@@ -1932,8 +1932,8 @@
           <w:rFonts w:cstheme="majorHAnsi"/>
           <w:bCs w:val="0"/>
           <w:iCs/>
-          <w:color w:val="000000" w:themeColor="text1"/>
-          <w:sz w:val="22"/>
+          <w:color w:val="FF0000"/>
+          <w:sz w:val="28"/>
           <w:szCs w:val="22"/>
         </w:rPr>
         <w:t xml:space="preserve"> horas de trabajo autónomo</w:t>
@@ -1951,7 +1951,10 @@
         <w:t>)</w:t>
       </w:r>
     </w:p>
-    <w:p/>
+    <w:p>
+      <w:bookmarkStart w:id="1" w:name="_GoBack"/>
+      <w:bookmarkEnd w:id="1"/>
+    </w:p>
     <w:tbl>
       <w:tblPr>
         <w:tblStyle w:val="Tablaconcuadrcula"/>
@@ -6321,7 +6324,7 @@
                 <w:color w:val="000000" w:themeColor="text1"/>
               </w:rPr>
             </w:pPr>
-            <w:bookmarkStart w:id="1" w:name="_Hlk194658739"/>
+            <w:bookmarkStart w:id="2" w:name="_Hlk194658739"/>
             <w:r>
               <w:rPr>
                 <w:rFonts w:asciiTheme="majorHAnsi" w:hAnsiTheme="majorHAnsi" w:cstheme="majorHAnsi"/>
@@ -6527,9 +6530,35 @@
               <w:t>Sesiones mediadas por TIC 50 %</w:t>
             </w:r>
           </w:p>
+          <w:p>
+            <w:pPr>
+              <w:spacing w:line="240" w:lineRule="auto"/>
+              <w:jc w:val="center"/>
+              <w:rPr>
+                <w:rFonts w:asciiTheme="majorHAnsi" w:hAnsiTheme="majorHAnsi" w:cstheme="majorHAnsi"/>
+                <w:color w:val="000000" w:themeColor="text1"/>
+              </w:rPr>
+            </w:pPr>
+            <w:r>
+              <w:rPr>
+                <w:rFonts w:asciiTheme="majorHAnsi" w:hAnsiTheme="majorHAnsi" w:cstheme="majorHAnsi"/>
+                <w:color w:val="000000" w:themeColor="text1"/>
+              </w:rPr>
+              <w:t xml:space="preserve">William Ruiz </w:t>
+            </w:r>
+            <w:proofErr w:type="spellStart"/>
+            <w:r>
+              <w:rPr>
+                <w:rFonts w:asciiTheme="majorHAnsi" w:hAnsiTheme="majorHAnsi" w:cstheme="majorHAnsi"/>
+                <w:color w:val="000000" w:themeColor="text1"/>
+              </w:rPr>
+              <w:t>Garcia</w:t>
+            </w:r>
+            <w:proofErr w:type="spellEnd"/>
+          </w:p>
         </w:tc>
       </w:tr>
-      <w:bookmarkEnd w:id="1"/>
+      <w:bookmarkEnd w:id="2"/>
     </w:tbl>
     <w:p>
       <w:pPr>
@@ -6659,6 +6688,7 @@
                 <w:bCs/>
                 <w:color w:val="000000" w:themeColor="text1"/>
               </w:rPr>
+              <w:lastRenderedPageBreak/>
               <w:t>LUGAR</w:t>
             </w:r>
           </w:p>
@@ -6720,7 +6750,6 @@
                 <w:bCs/>
                 <w:color w:val="000000" w:themeColor="text1"/>
               </w:rPr>
-              <w:lastRenderedPageBreak/>
               <w:t>Departamento</w:t>
             </w:r>
           </w:p>
@@ -7183,7 +7212,7 @@
           <w:color w:val="000000" w:themeColor="text1"/>
         </w:rPr>
       </w:pPr>
-      <w:bookmarkStart w:id="2" w:name="_Hlk191324125"/>
+      <w:bookmarkStart w:id="3" w:name="_Hlk191324125"/>
     </w:p>
     <w:tbl>
       <w:tblPr>
@@ -7389,7 +7418,7 @@
           </w:p>
         </w:tc>
       </w:tr>
-      <w:bookmarkEnd w:id="2"/>
+      <w:bookmarkEnd w:id="3"/>
     </w:tbl>
     <w:p>
       <w:pPr>
@@ -7429,7 +7458,7 @@
         </w:rPr>
         <w:t xml:space="preserve">PERFILES Y </w:t>
       </w:r>
-      <w:bookmarkStart w:id="3" w:name="_Hlk191324021"/>
+      <w:bookmarkStart w:id="4" w:name="_Hlk191324021"/>
       <w:r>
         <w:rPr>
           <w:rFonts w:asciiTheme="majorHAnsi" w:hAnsiTheme="majorHAnsi" w:cstheme="majorHAnsi"/>
@@ -7439,7 +7468,7 @@
         </w:rPr>
         <w:t>REQUISITOS DE APLICACIÓN</w:t>
       </w:r>
-      <w:bookmarkEnd w:id="3"/>
+      <w:bookmarkEnd w:id="4"/>
       <w:r>
         <w:rPr>
           <w:rFonts w:asciiTheme="majorHAnsi" w:hAnsiTheme="majorHAnsi" w:cstheme="majorHAnsi"/>
@@ -7598,7 +7627,7 @@
         </w:rPr>
         <w:t>y los elementos de protección personal.</w:t>
       </w:r>
-      <w:bookmarkStart w:id="4" w:name="_Hlk191324037"/>
+      <w:bookmarkStart w:id="5" w:name="_Hlk191324037"/>
     </w:p>
     <w:p>
       <w:pPr>
@@ -7736,7 +7765,7 @@
         </w:rPr>
       </w:pPr>
     </w:p>
-    <w:bookmarkEnd w:id="4"/>
+    <w:bookmarkEnd w:id="5"/>
     <w:p>
       <w:pPr>
         <w:pStyle w:val="Prrafodelista"/>
@@ -7756,15 +7785,8 @@
           <w:rFonts w:asciiTheme="majorHAnsi" w:hAnsiTheme="majorHAnsi" w:cstheme="majorHAnsi"/>
           <w:color w:val="000000" w:themeColor="text1"/>
         </w:rPr>
-        <w:t xml:space="preserve">Registrar la información solicitada en el formulario establecido en esta convocatoria para tal fin y adjuntar en éste el acta de compromiso vigente, debidamente </w:t>
-      </w:r>
-      <w:r>
-        <w:rPr>
-          <w:rFonts w:asciiTheme="majorHAnsi" w:hAnsiTheme="majorHAnsi" w:cstheme="majorHAnsi"/>
-          <w:color w:val="000000" w:themeColor="text1"/>
-        </w:rPr>
         <w:lastRenderedPageBreak/>
-        <w:t xml:space="preserve">diligenciada con las firmas correspondientes y los demás documentos </w:t>
+        <w:t xml:space="preserve">Registrar la información solicitada en el formulario establecido en esta convocatoria para tal fin y adjuntar en éste el acta de compromiso vigente, debidamente diligenciada con las firmas correspondientes y los demás documentos </w:t>
       </w:r>
       <w:r>
         <w:rPr>
@@ -8050,28 +8072,13 @@
           <w:b/>
           <w:bCs/>
         </w:rPr>
-        <w:t xml:space="preserve">, </w:t>
+        <w:t>, 21730061         FUNDAMENTOS DE PROGRAMACIÓN  60 horas</w:t>
       </w:r>
       <w:r>
         <w:rPr>
           <w:b/>
           <w:bCs/>
         </w:rPr>
-        <w:t xml:space="preserve">21730061         FUNDAMENTOS DE PROGRAMACIÓN  60 </w:t>
-      </w:r>
-      <w:proofErr w:type="gramStart"/>
-      <w:r>
-        <w:rPr>
-          <w:b/>
-          <w:bCs/>
-        </w:rPr>
-        <w:t>horas</w:t>
-      </w:r>
-      <w:r>
-        <w:rPr>
-          <w:b/>
-          <w:bCs/>
-        </w:rPr>
         <w:t xml:space="preserve"> </w:t>
       </w:r>
       <w:r>
@@ -8088,7 +8095,6 @@
         </w:rPr>
         <w:t>ara</w:t>
       </w:r>
-      <w:proofErr w:type="gramEnd"/>
       <w:r>
         <w:rPr>
           <w:rFonts w:asciiTheme="majorHAnsi" w:hAnsiTheme="majorHAnsi" w:cstheme="majorHAnsi"/>
@@ -8479,7 +8485,7 @@
           <w:color w:val="000000" w:themeColor="text1"/>
         </w:rPr>
       </w:pPr>
-      <w:bookmarkStart w:id="5" w:name="_Hlk191324196"/>
+      <w:bookmarkStart w:id="6" w:name="_Hlk191324196"/>
       <w:r>
         <w:rPr>
           <w:rFonts w:asciiTheme="majorHAnsi" w:hAnsiTheme="majorHAnsi" w:cstheme="majorHAnsi"/>
@@ -8490,7 +8496,7 @@
         <w:t xml:space="preserve">CRITERIOS DE SELECCIÓN Y DESEMPATE: </w:t>
       </w:r>
     </w:p>
-    <w:bookmarkEnd w:id="5"/>
+    <w:bookmarkEnd w:id="6"/>
     <w:p>
       <w:pPr>
         <w:pStyle w:val="Prrafodelista"/>
@@ -8548,7 +8554,7 @@
           <w:color w:val="000000" w:themeColor="text1"/>
         </w:rPr>
       </w:pPr>
-      <w:bookmarkStart w:id="6" w:name="_Hlk191324262"/>
+      <w:bookmarkStart w:id="7" w:name="_Hlk191324262"/>
       <w:r>
         <w:rPr>
           <w:rFonts w:asciiTheme="majorHAnsi" w:hAnsiTheme="majorHAnsi" w:cstheme="majorHAnsi"/>
@@ -8601,7 +8607,7 @@
         <w:t xml:space="preserve"> instructores que se registren en el formulario adjuntando el acta de compromiso totalmente diligenciada y firmada entre las partes, validando que cumplen con los prerrequisitos del curso.</w:t>
       </w:r>
     </w:p>
-    <w:bookmarkEnd w:id="6"/>
+    <w:bookmarkEnd w:id="7"/>
     <w:p>
       <w:pPr>
         <w:pStyle w:val="Prrafodelista"/>
@@ -8846,23 +8852,7 @@
           <w:rFonts w:asciiTheme="majorHAnsi" w:hAnsiTheme="majorHAnsi" w:cstheme="majorHAnsi"/>
           <w:color w:val="000000" w:themeColor="text1"/>
         </w:rPr>
-        <w:t xml:space="preserve"> _Jaime López (</w:t>
-      </w:r>
-      <w:proofErr w:type="gramStart"/>
-      <w:r>
-        <w:rPr>
-          <w:rFonts w:asciiTheme="majorHAnsi" w:hAnsiTheme="majorHAnsi" w:cstheme="majorHAnsi"/>
-          <w:color w:val="000000" w:themeColor="text1"/>
-        </w:rPr>
-        <w:t>PDF)  Ejemplo</w:t>
-      </w:r>
-      <w:proofErr w:type="gramEnd"/>
-      <w:r>
-        <w:rPr>
-          <w:rFonts w:asciiTheme="majorHAnsi" w:hAnsiTheme="majorHAnsi" w:cstheme="majorHAnsi"/>
-          <w:color w:val="000000" w:themeColor="text1"/>
-        </w:rPr>
-        <w:t>: ACTA_CC_12345678_ Jaime López</w:t>
+        <w:t xml:space="preserve"> _Jaime López (PDF)  Ejemplo: ACTA_CC_12345678_ Jaime López</w:t>
       </w:r>
     </w:p>
     <w:p>
@@ -11153,7 +11143,7 @@
 </file>
 
 <file path=word/endnotes.xml><?xml version="1.0" encoding="utf-8"?>
-<w:endnotes xmlns:wpc="http://schemas.microsoft.com/office/word/2010/wordprocessingCanvas" xmlns:cx="http://schemas.microsoft.com/office/drawing/2014/chartex" xmlns:cx1="http://schemas.microsoft.com/office/drawing/2015/9/8/chartex" xmlns:cx2="http://schemas.microsoft.com/office/drawing/2015/10/21/chartex" xmlns:cx3="http://schemas.microsoft.com/office/drawing/2016/5/9/chartex" xmlns:cx4="http://schemas.microsoft.com/office/drawing/2016/5/10/chartex" xmlns:cx5="http://schemas.microsoft.com/office/drawing/2016/5/11/chartex" xmlns:cx6="http://schemas.microsoft.com/office/drawing/2016/5/12/chartex" xmlns:cx7="http://schemas.microsoft.com/office/drawing/2016/5/13/chartex" xmlns:cx8="http://schemas.microsoft.com/office/drawing/2016/5/14/chartex" xmlns:mc="http://schemas.openxmlformats.org/markup-compatibility/2006" xmlns:aink="http://schemas.microsoft.com/office/drawing/2016/ink" xmlns:am3d="http://schemas.microsoft.com/office/drawing/2017/model3d" xmlns:o="urn:schemas-microsoft-com:office:office" xmlns:oel="http://schemas.microsoft.com/office/2019/extlst" xmlns:r="http://schemas.openxmlformats.org/officeDocument/2006/relationships" xmlns:m="http://schemas.openxmlformats.org/officeDocument/2006/math" xmlns:v="urn:schemas-microsoft-com:vml" xmlns:wp14="http://schemas.microsoft.com/office/word/2010/wordprocessingDrawing" xmlns:wp="http://schemas.openxmlformats.org/drawingml/2006/wordprocessingDrawing" xmlns:w10="urn:schemas-microsoft-com:office:word" xmlns:w="http://schemas.openxmlformats.org/wordprocessingml/2006/main" xmlns:w14="http://schemas.microsoft.com/office/word/2010/wordml" xmlns:w15="http://schemas.microsoft.com/office/word/2012/wordml" xmlns:w16cex="http://schemas.microsoft.com/office/word/2018/wordml/cex" xmlns:w16cid="http://schemas.microsoft.com/office/word/2016/wordml/cid" xmlns:w16="http://schemas.microsoft.com/office/word/2018/wordml" xmlns:w16du="http://schemas.microsoft.com/office/word/2023/wordml/word16du" xmlns:w16sdtdh="http://schemas.microsoft.com/office/word/2020/wordml/sdtdatahash" xmlns:w16sdtfl="http://schemas.microsoft.com/office/word/2024/wordml/sdtformatlock" xmlns:w16se="http://schemas.microsoft.com/office/word/2015/wordml/symex" xmlns:wpg="http://schemas.microsoft.com/office/word/2010/wordprocessingGroup" xmlns:wpi="http://schemas.microsoft.com/office/word/2010/wordprocessingInk" xmlns:wne="http://schemas.microsoft.com/office/word/2006/wordml" xmlns:wps="http://schemas.microsoft.com/office/word/2010/wordprocessingShape" mc:Ignorable="w14 w15 w16se w16cid w16 w16cex w16sdtdh w16sdtfl w16du wp14">
+<w:endnotes xmlns:wpc="http://schemas.microsoft.com/office/word/2010/wordprocessingCanvas" xmlns:cx="http://schemas.microsoft.com/office/drawing/2014/chartex" xmlns:cx1="http://schemas.microsoft.com/office/drawing/2015/9/8/chartex" xmlns:cx2="http://schemas.microsoft.com/office/drawing/2015/10/21/chartex" xmlns:cx3="http://schemas.microsoft.com/office/drawing/2016/5/9/chartex" xmlns:cx4="http://schemas.microsoft.com/office/drawing/2016/5/10/chartex" xmlns:cx5="http://schemas.microsoft.com/office/drawing/2016/5/11/chartex" xmlns:cx6="http://schemas.microsoft.com/office/drawing/2016/5/12/chartex" xmlns:cx7="http://schemas.microsoft.com/office/drawing/2016/5/13/chartex" xmlns:cx8="http://schemas.microsoft.com/office/drawing/2016/5/14/chartex" xmlns:mc="http://schemas.openxmlformats.org/markup-compatibility/2006" xmlns:aink="http://schemas.microsoft.com/office/drawing/2016/ink" xmlns:am3d="http://schemas.microsoft.com/office/drawing/2017/model3d" xmlns:o="urn:schemas-microsoft-com:office:office" xmlns:r="http://schemas.openxmlformats.org/officeDocument/2006/relationships" xmlns:m="http://schemas.openxmlformats.org/officeDocument/2006/math" xmlns:v="urn:schemas-microsoft-com:vml" xmlns:wp14="http://schemas.microsoft.com/office/word/2010/wordprocessingDrawing" xmlns:wp="http://schemas.openxmlformats.org/drawingml/2006/wordprocessingDrawing" xmlns:w10="urn:schemas-microsoft-com:office:word" xmlns:w="http://schemas.openxmlformats.org/wordprocessingml/2006/main" xmlns:w14="http://schemas.microsoft.com/office/word/2010/wordml" xmlns:w15="http://schemas.microsoft.com/office/word/2012/wordml" xmlns:w16cid="http://schemas.microsoft.com/office/word/2016/wordml/cid" xmlns:w16se="http://schemas.microsoft.com/office/word/2015/wordml/symex" xmlns:wpg="http://schemas.microsoft.com/office/word/2010/wordprocessingGroup" xmlns:wpi="http://schemas.microsoft.com/office/word/2010/wordprocessingInk" xmlns:wne="http://schemas.microsoft.com/office/word/2006/wordml" xmlns:wps="http://schemas.microsoft.com/office/word/2010/wordprocessingShape" mc:Ignorable="w14 w15 w16se w16cid wp14">
   <w:endnote w:type="separator" w:id="-1">
     <w:p>
       <w:pPr>
@@ -11178,7 +11168,7 @@
 </file>
 
 <file path=word/footer1.xml><?xml version="1.0" encoding="utf-8"?>
-<w:ftr xmlns:wpc="http://schemas.microsoft.com/office/word/2010/wordprocessingCanvas" xmlns:cx="http://schemas.microsoft.com/office/drawing/2014/chartex" xmlns:cx1="http://schemas.microsoft.com/office/drawing/2015/9/8/chartex" xmlns:cx2="http://schemas.microsoft.com/office/drawing/2015/10/21/chartex" xmlns:cx3="http://schemas.microsoft.com/office/drawing/2016/5/9/chartex" xmlns:cx4="http://schemas.microsoft.com/office/drawing/2016/5/10/chartex" xmlns:cx5="http://schemas.microsoft.com/office/drawing/2016/5/11/chartex" xmlns:cx6="http://schemas.microsoft.com/office/drawing/2016/5/12/chartex" xmlns:cx7="http://schemas.microsoft.com/office/drawing/2016/5/13/chartex" xmlns:cx8="http://schemas.microsoft.com/office/drawing/2016/5/14/chartex" xmlns:mc="http://schemas.openxmlformats.org/markup-compatibility/2006" xmlns:aink="http://schemas.microsoft.com/office/drawing/2016/ink" xmlns:am3d="http://schemas.microsoft.com/office/drawing/2017/model3d" xmlns:o="urn:schemas-microsoft-com:office:office" xmlns:oel="http://schemas.microsoft.com/office/2019/extlst" xmlns:r="http://schemas.openxmlformats.org/officeDocument/2006/relationships" xmlns:m="http://schemas.openxmlformats.org/officeDocument/2006/math" xmlns:v="urn:schemas-microsoft-com:vml" xmlns:wp14="http://schemas.microsoft.com/office/word/2010/wordprocessingDrawing" xmlns:wp="http://schemas.openxmlformats.org/drawingml/2006/wordprocessingDrawing" xmlns:w10="urn:schemas-microsoft-com:office:word" xmlns:w="http://schemas.openxmlformats.org/wordprocessingml/2006/main" xmlns:w14="http://schemas.microsoft.com/office/word/2010/wordml" xmlns:w15="http://schemas.microsoft.com/office/word/2012/wordml" xmlns:w16cex="http://schemas.microsoft.com/office/word/2018/wordml/cex" xmlns:w16cid="http://schemas.microsoft.com/office/word/2016/wordml/cid" xmlns:w16="http://schemas.microsoft.com/office/word/2018/wordml" xmlns:w16du="http://schemas.microsoft.com/office/word/2023/wordml/word16du" xmlns:w16sdtdh="http://schemas.microsoft.com/office/word/2020/wordml/sdtdatahash" xmlns:w16sdtfl="http://schemas.microsoft.com/office/word/2024/wordml/sdtformatlock" xmlns:w16se="http://schemas.microsoft.com/office/word/2015/wordml/symex" xmlns:wpg="http://schemas.microsoft.com/office/word/2010/wordprocessingGroup" xmlns:wpi="http://schemas.microsoft.com/office/word/2010/wordprocessingInk" xmlns:wne="http://schemas.microsoft.com/office/word/2006/wordml" xmlns:wps="http://schemas.microsoft.com/office/word/2010/wordprocessingShape" mc:Ignorable="w14 w15 w16se w16cid w16 w16cex w16sdtdh w16sdtfl w16du wp14">
+<w:ftr xmlns:wpc="http://schemas.microsoft.com/office/word/2010/wordprocessingCanvas" xmlns:cx="http://schemas.microsoft.com/office/drawing/2014/chartex" xmlns:cx1="http://schemas.microsoft.com/office/drawing/2015/9/8/chartex" xmlns:cx2="http://schemas.microsoft.com/office/drawing/2015/10/21/chartex" xmlns:cx3="http://schemas.microsoft.com/office/drawing/2016/5/9/chartex" xmlns:cx4="http://schemas.microsoft.com/office/drawing/2016/5/10/chartex" xmlns:cx5="http://schemas.microsoft.com/office/drawing/2016/5/11/chartex" xmlns:cx6="http://schemas.microsoft.com/office/drawing/2016/5/12/chartex" xmlns:cx7="http://schemas.microsoft.com/office/drawing/2016/5/13/chartex" xmlns:cx8="http://schemas.microsoft.com/office/drawing/2016/5/14/chartex" xmlns:mc="http://schemas.openxmlformats.org/markup-compatibility/2006" xmlns:aink="http://schemas.microsoft.com/office/drawing/2016/ink" xmlns:am3d="http://schemas.microsoft.com/office/drawing/2017/model3d" xmlns:o="urn:schemas-microsoft-com:office:office" xmlns:r="http://schemas.openxmlformats.org/officeDocument/2006/relationships" xmlns:m="http://schemas.openxmlformats.org/officeDocument/2006/math" xmlns:v="urn:schemas-microsoft-com:vml" xmlns:wp14="http://schemas.microsoft.com/office/word/2010/wordprocessingDrawing" xmlns:wp="http://schemas.openxmlformats.org/drawingml/2006/wordprocessingDrawing" xmlns:w10="urn:schemas-microsoft-com:office:word" xmlns:w="http://schemas.openxmlformats.org/wordprocessingml/2006/main" xmlns:w14="http://schemas.microsoft.com/office/word/2010/wordml" xmlns:w15="http://schemas.microsoft.com/office/word/2012/wordml" xmlns:w16cid="http://schemas.microsoft.com/office/word/2016/wordml/cid" xmlns:w16se="http://schemas.microsoft.com/office/word/2015/wordml/symex" xmlns:wpg="http://schemas.microsoft.com/office/word/2010/wordprocessingGroup" xmlns:wpi="http://schemas.microsoft.com/office/word/2010/wordprocessingInk" xmlns:wne="http://schemas.microsoft.com/office/word/2006/wordml" xmlns:wps="http://schemas.microsoft.com/office/word/2010/wordprocessingShape" mc:Ignorable="w14 w15 w16se w16cid wp14">
   <w:sdt>
     <w:sdtPr>
       <w:id w:val="-1105643831"/>
@@ -11254,7 +11244,7 @@
 </file>
 
 <file path=word/footnotes.xml><?xml version="1.0" encoding="utf-8"?>
-<w:footnotes xmlns:wpc="http://schemas.microsoft.com/office/word/2010/wordprocessingCanvas" xmlns:cx="http://schemas.microsoft.com/office/drawing/2014/chartex" xmlns:cx1="http://schemas.microsoft.com/office/drawing/2015/9/8/chartex" xmlns:cx2="http://schemas.microsoft.com/office/drawing/2015/10/21/chartex" xmlns:cx3="http://schemas.microsoft.com/office/drawing/2016/5/9/chartex" xmlns:cx4="http://schemas.microsoft.com/office/drawing/2016/5/10/chartex" xmlns:cx5="http://schemas.microsoft.com/office/drawing/2016/5/11/chartex" xmlns:cx6="http://schemas.microsoft.com/office/drawing/2016/5/12/chartex" xmlns:cx7="http://schemas.microsoft.com/office/drawing/2016/5/13/chartex" xmlns:cx8="http://schemas.microsoft.com/office/drawing/2016/5/14/chartex" xmlns:mc="http://schemas.openxmlformats.org/markup-compatibility/2006" xmlns:aink="http://schemas.microsoft.com/office/drawing/2016/ink" xmlns:am3d="http://schemas.microsoft.com/office/drawing/2017/model3d" xmlns:o="urn:schemas-microsoft-com:office:office" xmlns:oel="http://schemas.microsoft.com/office/2019/extlst" xmlns:r="http://schemas.openxmlformats.org/officeDocument/2006/relationships" xmlns:m="http://schemas.openxmlformats.org/officeDocument/2006/math" xmlns:v="urn:schemas-microsoft-com:vml" xmlns:wp14="http://schemas.microsoft.com/office/word/2010/wordprocessingDrawing" xmlns:wp="http://schemas.openxmlformats.org/drawingml/2006/wordprocessingDrawing" xmlns:w10="urn:schemas-microsoft-com:office:word" xmlns:w="http://schemas.openxmlformats.org/wordprocessingml/2006/main" xmlns:w14="http://schemas.microsoft.com/office/word/2010/wordml" xmlns:w15="http://schemas.microsoft.com/office/word/2012/wordml" xmlns:w16cex="http://schemas.microsoft.com/office/word/2018/wordml/cex" xmlns:w16cid="http://schemas.microsoft.com/office/word/2016/wordml/cid" xmlns:w16="http://schemas.microsoft.com/office/word/2018/wordml" xmlns:w16du="http://schemas.microsoft.com/office/word/2023/wordml/word16du" xmlns:w16sdtdh="http://schemas.microsoft.com/office/word/2020/wordml/sdtdatahash" xmlns:w16sdtfl="http://schemas.microsoft.com/office/word/2024/wordml/sdtformatlock" xmlns:w16se="http://schemas.microsoft.com/office/word/2015/wordml/symex" xmlns:wpg="http://schemas.microsoft.com/office/word/2010/wordprocessingGroup" xmlns:wpi="http://schemas.microsoft.com/office/word/2010/wordprocessingInk" xmlns:wne="http://schemas.microsoft.com/office/word/2006/wordml" xmlns:wps="http://schemas.microsoft.com/office/word/2010/wordprocessingShape" mc:Ignorable="w14 w15 w16se w16cid w16 w16cex w16sdtdh w16sdtfl w16du wp14">
+<w:footnotes xmlns:wpc="http://schemas.microsoft.com/office/word/2010/wordprocessingCanvas" xmlns:cx="http://schemas.microsoft.com/office/drawing/2014/chartex" xmlns:cx1="http://schemas.microsoft.com/office/drawing/2015/9/8/chartex" xmlns:cx2="http://schemas.microsoft.com/office/drawing/2015/10/21/chartex" xmlns:cx3="http://schemas.microsoft.com/office/drawing/2016/5/9/chartex" xmlns:cx4="http://schemas.microsoft.com/office/drawing/2016/5/10/chartex" xmlns:cx5="http://schemas.microsoft.com/office/drawing/2016/5/11/chartex" xmlns:cx6="http://schemas.microsoft.com/office/drawing/2016/5/12/chartex" xmlns:cx7="http://schemas.microsoft.com/office/drawing/2016/5/13/chartex" xmlns:cx8="http://schemas.microsoft.com/office/drawing/2016/5/14/chartex" xmlns:mc="http://schemas.openxmlformats.org/markup-compatibility/2006" xmlns:aink="http://schemas.microsoft.com/office/drawing/2016/ink" xmlns:am3d="http://schemas.microsoft.com/office/drawing/2017/model3d" xmlns:o="urn:schemas-microsoft-com:office:office" xmlns:r="http://schemas.openxmlformats.org/officeDocument/2006/relationships" xmlns:m="http://schemas.openxmlformats.org/officeDocument/2006/math" xmlns:v="urn:schemas-microsoft-com:vml" xmlns:wp14="http://schemas.microsoft.com/office/word/2010/wordprocessingDrawing" xmlns:wp="http://schemas.openxmlformats.org/drawingml/2006/wordprocessingDrawing" xmlns:w10="urn:schemas-microsoft-com:office:word" xmlns:w="http://schemas.openxmlformats.org/wordprocessingml/2006/main" xmlns:w14="http://schemas.microsoft.com/office/word/2010/wordml" xmlns:w15="http://schemas.microsoft.com/office/word/2012/wordml" xmlns:w16cid="http://schemas.microsoft.com/office/word/2016/wordml/cid" xmlns:w16se="http://schemas.microsoft.com/office/word/2015/wordml/symex" xmlns:wpg="http://schemas.microsoft.com/office/word/2010/wordprocessingGroup" xmlns:wpi="http://schemas.microsoft.com/office/word/2010/wordprocessingInk" xmlns:wne="http://schemas.microsoft.com/office/word/2006/wordml" xmlns:wps="http://schemas.microsoft.com/office/word/2010/wordprocessingShape" mc:Ignorable="w14 w15 w16se w16cid wp14">
   <w:footnote w:type="separator" w:id="-1">
     <w:p>
       <w:pPr>
@@ -11312,7 +11302,7 @@
 </file>
 
 <file path=word/header1.xml><?xml version="1.0" encoding="utf-8"?>
-<w:hdr xmlns:wpc="http://schemas.microsoft.com/office/word/2010/wordprocessingCanvas" xmlns:cx="http://schemas.microsoft.com/office/drawing/2014/chartex" xmlns:cx1="http://schemas.microsoft.com/office/drawing/2015/9/8/chartex" xmlns:cx2="http://schemas.microsoft.com/office/drawing/2015/10/21/chartex" xmlns:cx3="http://schemas.microsoft.com/office/drawing/2016/5/9/chartex" xmlns:cx4="http://schemas.microsoft.com/office/drawing/2016/5/10/chartex" xmlns:cx5="http://schemas.microsoft.com/office/drawing/2016/5/11/chartex" xmlns:cx6="http://schemas.microsoft.com/office/drawing/2016/5/12/chartex" xmlns:cx7="http://schemas.microsoft.com/office/drawing/2016/5/13/chartex" xmlns:cx8="http://schemas.microsoft.com/office/drawing/2016/5/14/chartex" xmlns:mc="http://schemas.openxmlformats.org/markup-compatibility/2006" xmlns:aink="http://schemas.microsoft.com/office/drawing/2016/ink" xmlns:am3d="http://schemas.microsoft.com/office/drawing/2017/model3d" xmlns:o="urn:schemas-microsoft-com:office:office" xmlns:oel="http://schemas.microsoft.com/office/2019/extlst" xmlns:r="http://schemas.openxmlformats.org/officeDocument/2006/relationships" xmlns:m="http://schemas.openxmlformats.org/officeDocument/2006/math" xmlns:v="urn:schemas-microsoft-com:vml" xmlns:wp14="http://schemas.microsoft.com/office/word/2010/wordprocessingDrawing" xmlns:wp="http://schemas.openxmlformats.org/drawingml/2006/wordprocessingDrawing" xmlns:w10="urn:schemas-microsoft-com:office:word" xmlns:w="http://schemas.openxmlformats.org/wordprocessingml/2006/main" xmlns:w14="http://schemas.microsoft.com/office/word/2010/wordml" xmlns:w15="http://schemas.microsoft.com/office/word/2012/wordml" xmlns:w16cex="http://schemas.microsoft.com/office/word/2018/wordml/cex" xmlns:w16cid="http://schemas.microsoft.com/office/word/2016/wordml/cid" xmlns:w16="http://schemas.microsoft.com/office/word/2018/wordml" xmlns:w16du="http://schemas.microsoft.com/office/word/2023/wordml/word16du" xmlns:w16sdtdh="http://schemas.microsoft.com/office/word/2020/wordml/sdtdatahash" xmlns:w16sdtfl="http://schemas.microsoft.com/office/word/2024/wordml/sdtformatlock" xmlns:w16se="http://schemas.microsoft.com/office/word/2015/wordml/symex" xmlns:wpg="http://schemas.microsoft.com/office/word/2010/wordprocessingGroup" xmlns:wpi="http://schemas.microsoft.com/office/word/2010/wordprocessingInk" xmlns:wne="http://schemas.microsoft.com/office/word/2006/wordml" xmlns:wps="http://schemas.microsoft.com/office/word/2010/wordprocessingShape" mc:Ignorable="w14 w15 w16se w16cid w16 w16cex w16sdtdh w16sdtfl w16du wp14">
+<w:hdr xmlns:wpc="http://schemas.microsoft.com/office/word/2010/wordprocessingCanvas" xmlns:cx="http://schemas.microsoft.com/office/drawing/2014/chartex" xmlns:cx1="http://schemas.microsoft.com/office/drawing/2015/9/8/chartex" xmlns:cx2="http://schemas.microsoft.com/office/drawing/2015/10/21/chartex" xmlns:cx3="http://schemas.microsoft.com/office/drawing/2016/5/9/chartex" xmlns:cx4="http://schemas.microsoft.com/office/drawing/2016/5/10/chartex" xmlns:cx5="http://schemas.microsoft.com/office/drawing/2016/5/11/chartex" xmlns:cx6="http://schemas.microsoft.com/office/drawing/2016/5/12/chartex" xmlns:cx7="http://schemas.microsoft.com/office/drawing/2016/5/13/chartex" xmlns:cx8="http://schemas.microsoft.com/office/drawing/2016/5/14/chartex" xmlns:mc="http://schemas.openxmlformats.org/markup-compatibility/2006" xmlns:aink="http://schemas.microsoft.com/office/drawing/2016/ink" xmlns:am3d="http://schemas.microsoft.com/office/drawing/2017/model3d" xmlns:o="urn:schemas-microsoft-com:office:office" xmlns:r="http://schemas.openxmlformats.org/officeDocument/2006/relationships" xmlns:m="http://schemas.openxmlformats.org/officeDocument/2006/math" xmlns:v="urn:schemas-microsoft-com:vml" xmlns:wp14="http://schemas.microsoft.com/office/word/2010/wordprocessingDrawing" xmlns:wp="http://schemas.openxmlformats.org/drawingml/2006/wordprocessingDrawing" xmlns:w10="urn:schemas-microsoft-com:office:word" xmlns:w="http://schemas.openxmlformats.org/wordprocessingml/2006/main" xmlns:w14="http://schemas.microsoft.com/office/word/2010/wordml" xmlns:w15="http://schemas.microsoft.com/office/word/2012/wordml" xmlns:w16cid="http://schemas.microsoft.com/office/word/2016/wordml/cid" xmlns:w16se="http://schemas.microsoft.com/office/word/2015/wordml/symex" xmlns:wpg="http://schemas.microsoft.com/office/word/2010/wordprocessingGroup" xmlns:wpi="http://schemas.microsoft.com/office/word/2010/wordprocessingInk" xmlns:wne="http://schemas.microsoft.com/office/word/2006/wordml" xmlns:wps="http://schemas.microsoft.com/office/word/2010/wordprocessingShape" mc:Ignorable="w14 w15 w16se w16cid wp14">
   <w:p>
     <w:pPr>
       <w:pStyle w:val="Encabezado"/>
@@ -11376,7 +11366,7 @@
 </file>
 
 <file path=word/numbering.xml><?xml version="1.0" encoding="utf-8"?>
-<w:numbering xmlns:wpc="http://schemas.microsoft.com/office/word/2010/wordprocessingCanvas" xmlns:cx="http://schemas.microsoft.com/office/drawing/2014/chartex" xmlns:cx1="http://schemas.microsoft.com/office/drawing/2015/9/8/chartex" xmlns:cx2="http://schemas.microsoft.com/office/drawing/2015/10/21/chartex" xmlns:cx3="http://schemas.microsoft.com/office/drawing/2016/5/9/chartex" xmlns:cx4="http://schemas.microsoft.com/office/drawing/2016/5/10/chartex" xmlns:cx5="http://schemas.microsoft.com/office/drawing/2016/5/11/chartex" xmlns:cx6="http://schemas.microsoft.com/office/drawing/2016/5/12/chartex" xmlns:cx7="http://schemas.microsoft.com/office/drawing/2016/5/13/chartex" xmlns:cx8="http://schemas.microsoft.com/office/drawing/2016/5/14/chartex" xmlns:mc="http://schemas.openxmlformats.org/markup-compatibility/2006" xmlns:aink="http://schemas.microsoft.com/office/drawing/2016/ink" xmlns:am3d="http://schemas.microsoft.com/office/drawing/2017/model3d" xmlns:o="urn:schemas-microsoft-com:office:office" xmlns:oel="http://schemas.microsoft.com/office/2019/extlst" xmlns:r="http://schemas.openxmlformats.org/officeDocument/2006/relationships" xmlns:m="http://schemas.openxmlformats.org/officeDocument/2006/math" xmlns:v="urn:schemas-microsoft-com:vml" xmlns:wp14="http://schemas.microsoft.com/office/word/2010/wordprocessingDrawing" xmlns:wp="http://schemas.openxmlformats.org/drawingml/2006/wordprocessingDrawing" xmlns:w10="urn:schemas-microsoft-com:office:word" xmlns:w="http://schemas.openxmlformats.org/wordprocessingml/2006/main" xmlns:w14="http://schemas.microsoft.com/office/word/2010/wordml" xmlns:w15="http://schemas.microsoft.com/office/word/2012/wordml" xmlns:w16cex="http://schemas.microsoft.com/office/word/2018/wordml/cex" xmlns:w16cid="http://schemas.microsoft.com/office/word/2016/wordml/cid" xmlns:w16="http://schemas.microsoft.com/office/word/2018/wordml" xmlns:w16du="http://schemas.microsoft.com/office/word/2023/wordml/word16du" xmlns:w16sdtdh="http://schemas.microsoft.com/office/word/2020/wordml/sdtdatahash" xmlns:w16sdtfl="http://schemas.microsoft.com/office/word/2024/wordml/sdtformatlock" xmlns:w16se="http://schemas.microsoft.com/office/word/2015/wordml/symex" xmlns:wpg="http://schemas.microsoft.com/office/word/2010/wordprocessingGroup" xmlns:wpi="http://schemas.microsoft.com/office/word/2010/wordprocessingInk" xmlns:wne="http://schemas.microsoft.com/office/word/2006/wordml" xmlns:wps="http://schemas.microsoft.com/office/word/2010/wordprocessingShape" mc:Ignorable="w14 w15 w16se w16cid w16 w16cex w16sdtdh w16sdtfl w16du wp14">
+<w:numbering xmlns:wpc="http://schemas.microsoft.com/office/word/2010/wordprocessingCanvas" xmlns:cx="http://schemas.microsoft.com/office/drawing/2014/chartex" xmlns:cx1="http://schemas.microsoft.com/office/drawing/2015/9/8/chartex" xmlns:cx2="http://schemas.microsoft.com/office/drawing/2015/10/21/chartex" xmlns:cx3="http://schemas.microsoft.com/office/drawing/2016/5/9/chartex" xmlns:cx4="http://schemas.microsoft.com/office/drawing/2016/5/10/chartex" xmlns:cx5="http://schemas.microsoft.com/office/drawing/2016/5/11/chartex" xmlns:cx6="http://schemas.microsoft.com/office/drawing/2016/5/12/chartex" xmlns:cx7="http://schemas.microsoft.com/office/drawing/2016/5/13/chartex" xmlns:cx8="http://schemas.microsoft.com/office/drawing/2016/5/14/chartex" xmlns:mc="http://schemas.openxmlformats.org/markup-compatibility/2006" xmlns:aink="http://schemas.microsoft.com/office/drawing/2016/ink" xmlns:am3d="http://schemas.microsoft.com/office/drawing/2017/model3d" xmlns:o="urn:schemas-microsoft-com:office:office" xmlns:r="http://schemas.openxmlformats.org/officeDocument/2006/relationships" xmlns:m="http://schemas.openxmlformats.org/officeDocument/2006/math" xmlns:v="urn:schemas-microsoft-com:vml" xmlns:wp14="http://schemas.microsoft.com/office/word/2010/wordprocessingDrawing" xmlns:wp="http://schemas.openxmlformats.org/drawingml/2006/wordprocessingDrawing" xmlns:w10="urn:schemas-microsoft-com:office:word" xmlns:w="http://schemas.openxmlformats.org/wordprocessingml/2006/main" xmlns:w14="http://schemas.microsoft.com/office/word/2010/wordml" xmlns:w15="http://schemas.microsoft.com/office/word/2012/wordml" xmlns:w16cid="http://schemas.microsoft.com/office/word/2016/wordml/cid" xmlns:w16se="http://schemas.microsoft.com/office/word/2015/wordml/symex" xmlns:wpg="http://schemas.microsoft.com/office/word/2010/wordprocessingGroup" xmlns:wpi="http://schemas.microsoft.com/office/word/2010/wordprocessingInk" xmlns:wne="http://schemas.microsoft.com/office/word/2006/wordml" xmlns:wps="http://schemas.microsoft.com/office/word/2010/wordprocessingShape" mc:Ignorable="w14 w15 w16se w16cid wp14">
   <w:abstractNum w:abstractNumId="0" w15:restartNumberingAfterBreak="0">
     <w:nsid w:val="04653BE8"/>
     <w:multiLevelType w:val="hybridMultilevel"/>
@@ -12805,43 +12795,43 @@
       </w:rPr>
     </w:lvl>
   </w:abstractNum>
-  <w:num w:numId="1" w16cid:durableId="623199414">
+  <w:num w:numId="1">
     <w:abstractNumId w:val="0"/>
   </w:num>
-  <w:num w:numId="2" w16cid:durableId="942029150">
+  <w:num w:numId="2">
     <w:abstractNumId w:val="1"/>
   </w:num>
-  <w:num w:numId="3" w16cid:durableId="1101147859">
+  <w:num w:numId="3">
     <w:abstractNumId w:val="9"/>
   </w:num>
-  <w:num w:numId="4" w16cid:durableId="1053695734">
+  <w:num w:numId="4">
     <w:abstractNumId w:val="2"/>
   </w:num>
-  <w:num w:numId="5" w16cid:durableId="1855143803">
+  <w:num w:numId="5">
     <w:abstractNumId w:val="12"/>
   </w:num>
-  <w:num w:numId="6" w16cid:durableId="851263388">
+  <w:num w:numId="6">
     <w:abstractNumId w:val="7"/>
   </w:num>
-  <w:num w:numId="7" w16cid:durableId="1135878871">
+  <w:num w:numId="7">
     <w:abstractNumId w:val="8"/>
   </w:num>
-  <w:num w:numId="8" w16cid:durableId="1223718254">
+  <w:num w:numId="8">
     <w:abstractNumId w:val="11"/>
   </w:num>
-  <w:num w:numId="9" w16cid:durableId="2029208082">
+  <w:num w:numId="9">
     <w:abstractNumId w:val="5"/>
   </w:num>
-  <w:num w:numId="10" w16cid:durableId="844396772">
+  <w:num w:numId="10">
     <w:abstractNumId w:val="3"/>
   </w:num>
-  <w:num w:numId="11" w16cid:durableId="329454542">
+  <w:num w:numId="11">
     <w:abstractNumId w:val="4"/>
   </w:num>
-  <w:num w:numId="12" w16cid:durableId="692344872">
+  <w:num w:numId="12">
     <w:abstractNumId w:val="6"/>
   </w:num>
-  <w:num w:numId="13" w16cid:durableId="648442780">
+  <w:num w:numId="13">
     <w:abstractNumId w:val="10"/>
   </w:num>
   <w:numIdMacAtCleanup w:val="12"/>
@@ -12849,7 +12839,7 @@
 </file>
 
 <file path=word/styles.xml><?xml version="1.0" encoding="utf-8"?>
-<w:styles xmlns:mc="http://schemas.openxmlformats.org/markup-compatibility/2006" xmlns:r="http://schemas.openxmlformats.org/officeDocument/2006/relationships" xmlns:w="http://schemas.openxmlformats.org/wordprocessingml/2006/main" xmlns:w14="http://schemas.microsoft.com/office/word/2010/wordml" xmlns:w15="http://schemas.microsoft.com/office/word/2012/wordml" xmlns:w16cex="http://schemas.microsoft.com/office/word/2018/wordml/cex" xmlns:w16cid="http://schemas.microsoft.com/office/word/2016/wordml/cid" xmlns:w16="http://schemas.microsoft.com/office/word/2018/wordml" xmlns:w16du="http://schemas.microsoft.com/office/word/2023/wordml/word16du" xmlns:w16sdtdh="http://schemas.microsoft.com/office/word/2020/wordml/sdtdatahash" xmlns:w16sdtfl="http://schemas.microsoft.com/office/word/2024/wordml/sdtformatlock" xmlns:w16se="http://schemas.microsoft.com/office/word/2015/wordml/symex" mc:Ignorable="w14 w15 w16se w16cid w16 w16cex w16sdtdh w16sdtfl w16du">
+<w:styles xmlns:mc="http://schemas.openxmlformats.org/markup-compatibility/2006" xmlns:r="http://schemas.openxmlformats.org/officeDocument/2006/relationships" xmlns:w="http://schemas.openxmlformats.org/wordprocessingml/2006/main" xmlns:w14="http://schemas.microsoft.com/office/word/2010/wordml" xmlns:w15="http://schemas.microsoft.com/office/word/2012/wordml" xmlns:w16cid="http://schemas.microsoft.com/office/word/2016/wordml/cid" xmlns:w16se="http://schemas.microsoft.com/office/word/2015/wordml/symex" mc:Ignorable="w14 w15 w16se w16cid">
   <w:docDefaults>
     <w:rPrDefault>
       <w:rPr>
@@ -12861,7 +12851,7 @@
     </w:rPrDefault>
     <w:pPrDefault/>
   </w:docDefaults>
-  <w:latentStyles w:defLockedState="0" w:defUIPriority="99" w:defSemiHidden="0" w:defUnhideWhenUsed="0" w:defQFormat="0" w:count="376">
+  <w:latentStyles w:defLockedState="0" w:defUIPriority="99" w:defSemiHidden="0" w:defUnhideWhenUsed="0" w:defQFormat="0" w:count="375">
     <w:lsdException w:name="Normal" w:uiPriority="0" w:qFormat="1"/>
     <w:lsdException w:name="heading 1" w:uiPriority="9" w:qFormat="1"/>
     <w:lsdException w:name="heading 2" w:semiHidden="1" w:uiPriority="9" w:unhideWhenUsed="1" w:qFormat="1"/>
@@ -13237,7 +13227,6 @@
     <w:lsdException w:name="Smart Hyperlink" w:semiHidden="1" w:unhideWhenUsed="1"/>
     <w:lsdException w:name="Hashtag" w:semiHidden="1" w:unhideWhenUsed="1"/>
     <w:lsdException w:name="Unresolved Mention" w:semiHidden="1" w:unhideWhenUsed="1"/>
-    <w:lsdException w:name="Smart Link" w:semiHidden="1" w:unhideWhenUsed="1"/>
   </w:latentStyles>
   <w:style w:type="paragraph" w:default="1" w:styleId="Normal">
     <w:name w:val="Normal"/>
@@ -13319,6 +13308,7 @@
   <w:style w:type="character" w:default="1" w:styleId="Fuentedeprrafopredeter">
     <w:name w:val="Default Paragraph Font"/>
     <w:uiPriority w:val="1"/>
+    <w:semiHidden/>
     <w:unhideWhenUsed/>
   </w:style>
   <w:style w:type="table" w:default="1" w:styleId="Tablanormal">
@@ -14574,7 +14564,7 @@
 </file>
 
 <file path=customXml/itemProps1.xml><?xml version="1.0" encoding="utf-8"?>
-<ds:datastoreItem xmlns:ds="http://schemas.openxmlformats.org/officeDocument/2006/customXml" ds:itemID="{27915497-1394-4FE0-A399-CB1C50DA7BC8}">
+<ds:datastoreItem xmlns:ds="http://schemas.openxmlformats.org/officeDocument/2006/customXml" ds:itemID="{0B3DF2A5-D7CE-417B-96E0-FAD78ADF2A84}">
   <ds:schemaRefs>
     <ds:schemaRef ds:uri="http://schemas.openxmlformats.org/officeDocument/2006/bibliography"/>
   </ds:schemaRefs>

</xml_diff>